<commit_message>
inclusão de dois novos artigos
</commit_message>
<xml_diff>
--- a/documentos/08 03 2026 S3 Artigo 6 O Poder do Log de Chamadas.docx
+++ b/documentos/08 03 2026 S3 Artigo 6 O Poder do Log de Chamadas.docx
@@ -65,7 +65,7 @@
     <w:p>
       <w:r>
         <w:pict w14:anchorId="61D060AE">
-          <v:rect id="_x0000_i1097" style="width:0;height:1.5pt" o:hralign="center" o:hrstd="t" o:hrnoshade="t" o:hr="t" fillcolor="gray" stroked="f"/>
+          <v:rect id="_x0000_i1025" style="width:0;height:1.5pt" o:hralign="center" o:hrstd="t" o:hrnoshade="t" o:hr="t" fillcolor="gray" stroked="f"/>
         </w:pict>
       </w:r>
     </w:p>
@@ -186,7 +186,7 @@
     <w:p>
       <w:r>
         <w:pict w14:anchorId="1219DC43">
-          <v:rect id="_x0000_i1098" style="width:0;height:1.5pt" o:hralign="center" o:hrstd="t" o:hrnoshade="t" o:hr="t" fillcolor="gray" stroked="f"/>
+          <v:rect id="_x0000_i1026" style="width:0;height:1.5pt" o:hralign="center" o:hrstd="t" o:hrnoshade="t" o:hr="t" fillcolor="gray" stroked="f"/>
         </w:pict>
       </w:r>
     </w:p>
@@ -258,7 +258,7 @@
     <w:p>
       <w:r>
         <w:pict w14:anchorId="0523C325">
-          <v:rect id="_x0000_i1099" style="width:0;height:1.5pt" o:hralign="center" o:hrstd="t" o:hrnoshade="t" o:hr="t" fillcolor="gray" stroked="f"/>
+          <v:rect id="_x0000_i1027" style="width:0;height:1.5pt" o:hralign="center" o:hrstd="t" o:hrnoshade="t" o:hr="t" fillcolor="gray" stroked="f"/>
         </w:pict>
       </w:r>
     </w:p>
@@ -329,7 +329,7 @@
     <w:p>
       <w:r>
         <w:pict w14:anchorId="48021CE3">
-          <v:rect id="_x0000_i1100" style="width:0;height:1.5pt" o:hralign="center" o:hrstd="t" o:hrnoshade="t" o:hr="t" fillcolor="gray" stroked="f"/>
+          <v:rect id="_x0000_i1028" style="width:0;height:1.5pt" o:hralign="center" o:hrstd="t" o:hrnoshade="t" o:hr="t" fillcolor="gray" stroked="f"/>
         </w:pict>
       </w:r>
     </w:p>
@@ -358,15 +358,7 @@
     </w:p>
     <w:p>
       <w:r>
-        <w:t xml:space="preserve">Muitas vítimas de </w:t>
-      </w:r>
-      <w:proofErr w:type="spellStart"/>
-      <w:r>
-        <w:t>stalking</w:t>
-      </w:r>
-      <w:proofErr w:type="spellEnd"/>
-      <w:r>
-        <w:t xml:space="preserve"> bancário acreditam que sua palavra contra a do banco não tem valor. Como </w:t>
+        <w:t xml:space="preserve">Muitas vítimas de stalking bancário acreditam que sua palavra contra a do banco não tem valor. Como </w:t>
       </w:r>
       <w:r>
         <w:rPr>
@@ -392,7 +384,7 @@
     <w:p>
       <w:r>
         <w:pict w14:anchorId="141AFE05">
-          <v:rect id="_x0000_i1101" style="width:0;height:1.5pt" o:hralign="center" o:hrstd="t" o:hrnoshade="t" o:hr="t" fillcolor="gray" stroked="f"/>
+          <v:rect id="_x0000_i1029" style="width:0;height:1.5pt" o:hralign="center" o:hrstd="t" o:hrnoshade="t" o:hr="t" fillcolor="gray" stroked="f"/>
         </w:pict>
       </w:r>
     </w:p>
@@ -553,7 +545,7 @@
     <w:p>
       <w:r>
         <w:pict w14:anchorId="6A8FB937">
-          <v:rect id="_x0000_i1102" style="width:0;height:1.5pt" o:hralign="center" o:hrstd="t" o:hrnoshade="t" o:hr="t" fillcolor="gray" stroked="f"/>
+          <v:rect id="_x0000_i1030" style="width:0;height:1.5pt" o:hralign="center" o:hrstd="t" o:hrnoshade="t" o:hr="t" fillcolor="gray" stroked="f"/>
         </w:pict>
       </w:r>
     </w:p>
@@ -1035,7 +1027,7 @@
     <w:p>
       <w:r>
         <w:pict w14:anchorId="26C1640D">
-          <v:rect id="_x0000_i1103" style="width:0;height:1.5pt" o:hralign="center" o:hrstd="t" o:hrnoshade="t" o:hr="t" fillcolor="gray" stroked="f"/>
+          <v:rect id="_x0000_i1031" style="width:0;height:1.5pt" o:hralign="center" o:hrstd="t" o:hrnoshade="t" o:hr="t" fillcolor="gray" stroked="f"/>
         </w:pict>
       </w:r>
     </w:p>
@@ -1072,7 +1064,7 @@
     <w:p>
       <w:r>
         <w:pict w14:anchorId="6427FDDE">
-          <v:rect id="_x0000_i1104" style="width:0;height:1.5pt" o:hralign="center" o:hrstd="t" o:hrnoshade="t" o:hr="t" fillcolor="gray" stroked="f"/>
+          <v:rect id="_x0000_i1032" style="width:0;height:1.5pt" o:hralign="center" o:hrstd="t" o:hrnoshade="t" o:hr="t" fillcolor="gray" stroked="f"/>
         </w:pict>
       </w:r>
     </w:p>
@@ -1184,7 +1176,7 @@
     <w:p>
       <w:r>
         <w:pict w14:anchorId="6D4321DC">
-          <v:rect id="_x0000_i1105" style="width:0;height:1.5pt" o:hralign="center" o:hrstd="t" o:hrnoshade="t" o:hr="t" fillcolor="gray" stroked="f"/>
+          <v:rect id="_x0000_i1033" style="width:0;height:1.5pt" o:hralign="center" o:hrstd="t" o:hrnoshade="t" o:hr="t" fillcolor="gray" stroked="f"/>
         </w:pict>
       </w:r>
     </w:p>
@@ -1236,7 +1228,7 @@
     <w:p>
       <w:r>
         <w:pict w14:anchorId="4376EA8F">
-          <v:rect id="_x0000_i1106" style="width:0;height:1.5pt" o:hralign="center" o:hrstd="t" o:hrnoshade="t" o:hr="t" fillcolor="gray" stroked="f"/>
+          <v:rect id="_x0000_i1034" style="width:0;height:1.5pt" o:hralign="center" o:hrstd="t" o:hrnoshade="t" o:hr="t" fillcolor="gray" stroked="f"/>
         </w:pict>
       </w:r>
     </w:p>
@@ -1301,7 +1293,7 @@
     <w:p>
       <w:r>
         <w:pict w14:anchorId="441150AF">
-          <v:rect id="_x0000_i1107" style="width:0;height:1.5pt" o:hralign="center" o:hrstd="t" o:hrnoshade="t" o:hr="t" fillcolor="gray" stroked="f"/>
+          <v:rect id="_x0000_i1035" style="width:0;height:1.5pt" o:hralign="center" o:hrstd="t" o:hrnoshade="t" o:hr="t" fillcolor="gray" stroked="f"/>
         </w:pict>
       </w:r>
     </w:p>
@@ -1354,7 +1346,7 @@
     <w:p>
       <w:r>
         <w:pict w14:anchorId="67511028">
-          <v:rect id="_x0000_i1108" style="width:0;height:1.5pt" o:hralign="center" o:hrstd="t" o:hrnoshade="t" o:hr="t" fillcolor="gray" stroked="f"/>
+          <v:rect id="_x0000_i1036" style="width:0;height:1.5pt" o:hralign="center" o:hrstd="t" o:hrnoshade="t" o:hr="t" fillcolor="gray" stroked="f"/>
         </w:pict>
       </w:r>
     </w:p>
@@ -1442,6 +1434,1542 @@
           <w:bCs/>
         </w:rPr>
         <w:t>Dr. Lincoln, deseja que eu elabore agora a imagem de capa deste Artigo 6, mostrando um smartphone "emanando" gráficos estatísticos e balanças de justiça?</w:t>
+      </w:r>
+    </w:p>
+    <w:p>
+      <w:r>
+        <w:br w:type="page"/>
+      </w:r>
+      <w:r>
+        <w:lastRenderedPageBreak/>
+        <w:t>Com base no detalhado roteiro 7.0 Premium e na proposta estratégica fornecida, elaborei o conteúdo final do Artigo 6.</w:t>
+      </w:r>
+    </w:p>
+    <w:p>
+      <w:r>
+        <w:t>Este texto foi estruturado focado em:</w:t>
+      </w:r>
+    </w:p>
+    <w:p>
+      <w:pPr>
+        <w:numPr>
+          <w:ilvl w:val="0"/>
+          <w:numId w:val="6"/>
+        </w:numPr>
+      </w:pPr>
+      <w:r>
+        <w:rPr>
+          <w:b/>
+          <w:bCs/>
+        </w:rPr>
+        <w:t>SEO:</w:t>
+      </w:r>
+      <w:r>
+        <w:t xml:space="preserve"> Uso natural das palavras-chave e estruturação de headers (H1, H2, H3).</w:t>
+      </w:r>
+    </w:p>
+    <w:p>
+      <w:pPr>
+        <w:numPr>
+          <w:ilvl w:val="0"/>
+          <w:numId w:val="6"/>
+        </w:numPr>
+      </w:pPr>
+      <w:r>
+        <w:rPr>
+          <w:b/>
+          <w:bCs/>
+        </w:rPr>
+        <w:t>Retenção:</w:t>
+      </w:r>
+      <w:r>
+        <w:t xml:space="preserve"> Linguagem clara que contrapõe a "dor" do usuário (assédio) com a "solução técnica" (perícia), mantendo o interesse pela autoridade do Dr. Lincoln.</w:t>
+      </w:r>
+    </w:p>
+    <w:p>
+      <w:pPr>
+        <w:numPr>
+          <w:ilvl w:val="0"/>
+          <w:numId w:val="6"/>
+        </w:numPr>
+      </w:pPr>
+      <w:r>
+        <w:rPr>
+          <w:b/>
+          <w:bCs/>
+        </w:rPr>
+        <w:t>Conversão:</w:t>
+      </w:r>
+      <w:r>
+        <w:t xml:space="preserve"> </w:t>
+      </w:r>
+      <w:proofErr w:type="spellStart"/>
+      <w:r>
+        <w:t>CTAs</w:t>
+      </w:r>
+      <w:proofErr w:type="spellEnd"/>
+      <w:r>
+        <w:t xml:space="preserve"> (Chamadas para Ação) estratégicos ao longo do texto e um CTA final forte e dourado.</w:t>
+      </w:r>
+    </w:p>
+    <w:p>
+      <w:r>
+        <w:pict w14:anchorId="4835DEC8">
+          <v:rect id="_x0000_i1079" style="width:0;height:1.5pt" o:hralign="center" o:hrstd="t" o:hrnoshade="t" o:hr="t" fillcolor="gray" stroked="f"/>
+        </w:pict>
+      </w:r>
+    </w:p>
+    <w:p>
+      <w:pPr>
+        <w:rPr>
+          <w:b/>
+          <w:bCs/>
+        </w:rPr>
+      </w:pPr>
+      <w:r>
+        <w:rPr>
+          <w:b/>
+          <w:bCs/>
+        </w:rPr>
+        <w:t>Configurações de Bastidor (Metadados para SEO)</w:t>
+      </w:r>
+    </w:p>
+    <w:p>
+      <w:pPr>
+        <w:numPr>
+          <w:ilvl w:val="0"/>
+          <w:numId w:val="7"/>
+        </w:numPr>
+      </w:pPr>
+      <w:proofErr w:type="spellStart"/>
+      <w:r>
+        <w:rPr>
+          <w:b/>
+          <w:bCs/>
+        </w:rPr>
+        <w:t>Title</w:t>
+      </w:r>
+      <w:proofErr w:type="spellEnd"/>
+      <w:r>
+        <w:rPr>
+          <w:b/>
+          <w:bCs/>
+        </w:rPr>
+        <w:t xml:space="preserve"> </w:t>
+      </w:r>
+      <w:proofErr w:type="spellStart"/>
+      <w:r>
+        <w:rPr>
+          <w:b/>
+          <w:bCs/>
+        </w:rPr>
+        <w:t>Tag</w:t>
+      </w:r>
+      <w:proofErr w:type="spellEnd"/>
+      <w:r>
+        <w:rPr>
+          <w:b/>
+          <w:bCs/>
+        </w:rPr>
+        <w:t>:</w:t>
+      </w:r>
+      <w:r>
+        <w:t xml:space="preserve"> Como Transformar Log de Chamadas em Prova Judicial Irrefutável | Dr. Lincoln Sposito</w:t>
+      </w:r>
+    </w:p>
+    <w:p>
+      <w:pPr>
+        <w:numPr>
+          <w:ilvl w:val="0"/>
+          <w:numId w:val="7"/>
+        </w:numPr>
+      </w:pPr>
+      <w:r>
+        <w:rPr>
+          <w:b/>
+          <w:bCs/>
+        </w:rPr>
+        <w:t xml:space="preserve">Meta </w:t>
+      </w:r>
+      <w:proofErr w:type="spellStart"/>
+      <w:r>
+        <w:rPr>
+          <w:b/>
+          <w:bCs/>
+        </w:rPr>
+        <w:t>Description</w:t>
+      </w:r>
+      <w:proofErr w:type="spellEnd"/>
+      <w:r>
+        <w:rPr>
+          <w:b/>
+          <w:bCs/>
+        </w:rPr>
+        <w:t>:</w:t>
+      </w:r>
+      <w:r>
+        <w:t xml:space="preserve"> Entenda como a extração forense de logs do smartphone serve como prova material robusta contra o assédio bancário. Aprenda a organizar evidências com o especialista Dr. Lincoln Sposito. Não dependa apenas de prints.</w:t>
+      </w:r>
+    </w:p>
+    <w:p>
+      <w:pPr>
+        <w:numPr>
+          <w:ilvl w:val="0"/>
+          <w:numId w:val="7"/>
+        </w:numPr>
+      </w:pPr>
+      <w:r>
+        <w:rPr>
+          <w:b/>
+          <w:bCs/>
+        </w:rPr>
+        <w:t>Keywords:</w:t>
+      </w:r>
+      <w:r>
+        <w:t xml:space="preserve"> Log de Chamadas Prova Judicial, Extração de Dados Smartphone, Perícia Digital, Prova de Assédio Bancário, Cadeia de Custódia Digital, Engenharia Forense de Dados, Dr. Lincoln Sposito.</w:t>
+      </w:r>
+    </w:p>
+    <w:p>
+      <w:pPr>
+        <w:numPr>
+          <w:ilvl w:val="0"/>
+          <w:numId w:val="7"/>
+        </w:numPr>
+      </w:pPr>
+      <w:r>
+        <w:rPr>
+          <w:b/>
+          <w:bCs/>
+        </w:rPr>
+        <w:t>URL Amigável (Canonical):</w:t>
+      </w:r>
+      <w:r>
+        <w:t xml:space="preserve"> drlincolnsposito.com.br/prova-pericial/poder-log-chamadas-prova-judicial-assedio.html</w:t>
+      </w:r>
+    </w:p>
+    <w:p>
+      <w:r>
+        <w:pict w14:anchorId="55B086CE">
+          <v:rect id="_x0000_i1080" style="width:0;height:1.5pt" o:hralign="center" o:hrstd="t" o:hrnoshade="t" o:hr="t" fillcolor="gray" stroked="f"/>
+        </w:pict>
+      </w:r>
+    </w:p>
+    <w:p>
+      <w:pPr>
+        <w:rPr>
+          <w:b/>
+          <w:bCs/>
+        </w:rPr>
+      </w:pPr>
+      <w:r>
+        <w:rPr>
+          <w:b/>
+          <w:bCs/>
+        </w:rPr>
+        <w:t>Conteúdo do Artigo</w:t>
+      </w:r>
+    </w:p>
+    <w:p>
+      <w:r>
+        <w:rPr>
+          <w:rFonts w:ascii="Segoe UI Emoji" w:hAnsi="Segoe UI Emoji" w:cs="Segoe UI Emoji"/>
+          <w:b/>
+          <w:bCs/>
+        </w:rPr>
+        <w:t>📋</w:t>
+      </w:r>
+      <w:r>
+        <w:rPr>
+          <w:b/>
+          <w:bCs/>
+        </w:rPr>
+        <w:t xml:space="preserve"> </w:t>
+      </w:r>
+      <w:proofErr w:type="spellStart"/>
+      <w:r>
+        <w:rPr>
+          <w:b/>
+          <w:bCs/>
+        </w:rPr>
+        <w:t>Breadcrumb</w:t>
+      </w:r>
+      <w:proofErr w:type="spellEnd"/>
+      <w:r>
+        <w:rPr>
+          <w:b/>
+          <w:bCs/>
+        </w:rPr>
+        <w:t>:</w:t>
+      </w:r>
+      <w:r>
+        <w:t xml:space="preserve"> </w:t>
+      </w:r>
+      <w:hyperlink r:id="rId6" w:tgtFrame="_blank" w:history="1">
+        <w:r>
+          <w:rPr>
+            <w:rStyle w:val="Hyperlink"/>
+          </w:rPr>
+          <w:t>Início</w:t>
+        </w:r>
+      </w:hyperlink>
+      <w:r>
+        <w:t xml:space="preserve"> &gt; </w:t>
+      </w:r>
+      <w:hyperlink r:id="rId7" w:tgtFrame="_blank" w:history="1">
+        <w:r>
+          <w:rPr>
+            <w:rStyle w:val="Hyperlink"/>
+          </w:rPr>
+          <w:t>Prova Pericial</w:t>
+        </w:r>
+      </w:hyperlink>
+      <w:r>
+        <w:t xml:space="preserve"> &gt; </w:t>
+      </w:r>
+      <w:r>
+        <w:rPr>
+          <w:b/>
+          <w:bCs/>
+        </w:rPr>
+        <w:t>O Poder dos Logs</w:t>
+      </w:r>
+    </w:p>
+    <w:p>
+      <w:r>
+        <w:rPr>
+          <w:rFonts w:ascii="Segoe UI Emoji" w:hAnsi="Segoe UI Emoji" w:cs="Segoe UI Emoji"/>
+          <w:b/>
+          <w:bCs/>
+        </w:rPr>
+        <w:t>🏷️</w:t>
+      </w:r>
+      <w:r>
+        <w:rPr>
+          <w:b/>
+          <w:bCs/>
+        </w:rPr>
+        <w:t xml:space="preserve"> </w:t>
+      </w:r>
+      <w:proofErr w:type="spellStart"/>
+      <w:r>
+        <w:rPr>
+          <w:b/>
+          <w:bCs/>
+        </w:rPr>
+        <w:t>Tags</w:t>
+      </w:r>
+      <w:proofErr w:type="spellEnd"/>
+      <w:r>
+        <w:rPr>
+          <w:b/>
+          <w:bCs/>
+        </w:rPr>
+        <w:t>:</w:t>
+      </w:r>
+      <w:r>
+        <w:t xml:space="preserve"> Engenharia Forense | Direito Digital | Prova Digital | Assédio Bancário | CDC Art. 42</w:t>
+      </w:r>
+    </w:p>
+    <w:p>
+      <w:r>
+        <w:rPr>
+          <w:rFonts w:ascii="Segoe UI Emoji" w:hAnsi="Segoe UI Emoji" w:cs="Segoe UI Emoji"/>
+          <w:b/>
+          <w:bCs/>
+        </w:rPr>
+        <w:t>📅</w:t>
+      </w:r>
+      <w:r>
+        <w:rPr>
+          <w:b/>
+          <w:bCs/>
+        </w:rPr>
+        <w:t xml:space="preserve"> Publicado em:</w:t>
+      </w:r>
+      <w:r>
+        <w:t xml:space="preserve"> 29 de Março de 2026</w:t>
+      </w:r>
+    </w:p>
+    <w:p>
+      <w:r>
+        <w:pict w14:anchorId="7030791B">
+          <v:rect id="_x0000_i1081" style="width:0;height:1.5pt" o:hralign="center" o:hrstd="t" o:hrnoshade="t" o:hr="t" fillcolor="gray" stroked="f"/>
+        </w:pict>
+      </w:r>
+    </w:p>
+    <w:p>
+      <w:pPr>
+        <w:rPr>
+          <w:b/>
+          <w:bCs/>
+        </w:rPr>
+      </w:pPr>
+      <w:r>
+        <w:rPr>
+          <w:b/>
+          <w:bCs/>
+        </w:rPr>
+        <w:t>O Poder do Log de Chamadas: Transformando seu Celular em uma Prova Judicial Irrefutável</w:t>
+      </w:r>
+    </w:p>
+    <w:p>
+      <w:r>
+        <w:t xml:space="preserve">Muitas vítimas de </w:t>
+      </w:r>
+      <w:r>
+        <w:rPr>
+          <w:i/>
+          <w:iCs/>
+        </w:rPr>
+        <w:t>stalking</w:t>
+      </w:r>
+      <w:r>
+        <w:t xml:space="preserve"> e assédio bancário vivem com a angustiante sensação de que é a "sua palavra contra a do banco". Elas acreditam que, por não terem gravado todas as conversas, não possuem provas do abuso.</w:t>
+      </w:r>
+    </w:p>
+    <w:p>
+      <w:r>
+        <w:t xml:space="preserve">Como Analista de Sistemas e Perito Judicial, afirmo categoricamente: </w:t>
+      </w:r>
+      <w:r>
+        <w:rPr>
+          <w:b/>
+          <w:bCs/>
+        </w:rPr>
+        <w:t>o banco deixa uma "impressão digital" a cada chamada efetuada.</w:t>
+      </w:r>
+    </w:p>
+    <w:p>
+      <w:r>
+        <w:t xml:space="preserve">O log de chamadas do seu celular não é apenas uma lista efêmera de números; ele é o </w:t>
+      </w:r>
+      <w:r>
+        <w:rPr>
+          <w:b/>
+          <w:bCs/>
+        </w:rPr>
+        <w:t>Corpo de Delito Digital</w:t>
+      </w:r>
+      <w:r>
+        <w:t xml:space="preserve">. Quando extraído e organizado através da Engenharia Forense de Dados, este registro </w:t>
+      </w:r>
+      <w:r>
+        <w:lastRenderedPageBreak/>
+        <w:t>bruto prova que a "metralhadora de ligações" não é um erro sistêmico isolado, mas sim um método de coação desenhado para violar o seu sossego e dignidade.</w:t>
+      </w:r>
+    </w:p>
+    <w:p>
+      <w:pPr>
+        <w:rPr>
+          <w:b/>
+          <w:bCs/>
+        </w:rPr>
+      </w:pPr>
+      <w:r>
+        <w:rPr>
+          <w:b/>
+          <w:bCs/>
+        </w:rPr>
+        <w:t>1. O Que é o Log de Chamadas para a Justiça (Sob a Ótica Pericial)</w:t>
+      </w:r>
+    </w:p>
+    <w:p>
+      <w:r>
+        <w:t xml:space="preserve">No Direito Digital contemporâneo, a prova precisa superar o nível do indício e alcançar a </w:t>
+      </w:r>
+      <w:r>
+        <w:rPr>
+          <w:b/>
+          <w:bCs/>
+        </w:rPr>
+        <w:t>integridade auditável</w:t>
+      </w:r>
+      <w:r>
+        <w:t>. Um simples print de tela não faz isso (veja a comparação abaixo).</w:t>
+      </w:r>
+    </w:p>
+    <w:p>
+      <w:r>
+        <w:t xml:space="preserve">Para que o tribunal aceite o registro do seu celular como prova material robusta, precisamos analisar os </w:t>
+      </w:r>
+      <w:r>
+        <w:rPr>
+          <w:b/>
+          <w:bCs/>
+        </w:rPr>
+        <w:t>metadados</w:t>
+      </w:r>
+      <w:r>
+        <w:t xml:space="preserve"> fundamentais contidos no log:</w:t>
+      </w:r>
+    </w:p>
+    <w:p>
+      <w:pPr>
+        <w:numPr>
+          <w:ilvl w:val="0"/>
+          <w:numId w:val="8"/>
+        </w:numPr>
+      </w:pPr>
+      <w:proofErr w:type="spellStart"/>
+      <w:r>
+        <w:rPr>
+          <w:b/>
+          <w:bCs/>
+        </w:rPr>
+        <w:t>Timestamp</w:t>
+      </w:r>
+      <w:proofErr w:type="spellEnd"/>
+      <w:r>
+        <w:rPr>
+          <w:b/>
+          <w:bCs/>
+        </w:rPr>
+        <w:t xml:space="preserve"> (Marca Temporal):</w:t>
+      </w:r>
+      <w:r>
+        <w:t xml:space="preserve"> A hora exata, minuto e segundo de cada tentativa. Isso prova a interrupção do sono (ligações fora do horário comercial), do trabalho ou de momentos de lazer.</w:t>
+      </w:r>
+    </w:p>
+    <w:p>
+      <w:pPr>
+        <w:numPr>
+          <w:ilvl w:val="0"/>
+          <w:numId w:val="8"/>
+        </w:numPr>
+      </w:pPr>
+      <w:r>
+        <w:rPr>
+          <w:b/>
+          <w:bCs/>
+        </w:rPr>
+        <w:t>Duração:</w:t>
+      </w:r>
+      <w:r>
+        <w:t xml:space="preserve"> Essencial para identificar as famigeradas "chamadas mudas" (</w:t>
+      </w:r>
+      <w:proofErr w:type="spellStart"/>
+      <w:r>
+        <w:rPr>
+          <w:i/>
+          <w:iCs/>
+        </w:rPr>
+        <w:t>drop</w:t>
+      </w:r>
+      <w:proofErr w:type="spellEnd"/>
+      <w:r>
+        <w:rPr>
+          <w:i/>
+          <w:iCs/>
+        </w:rPr>
+        <w:t xml:space="preserve"> </w:t>
+      </w:r>
+      <w:proofErr w:type="spellStart"/>
+      <w:r>
+        <w:rPr>
+          <w:i/>
+          <w:iCs/>
+        </w:rPr>
+        <w:t>calls</w:t>
+      </w:r>
+      <w:proofErr w:type="spellEnd"/>
+      <w:r>
+        <w:t>). A alta frequência de chamadas com duração de 0 a 3 segundos demonstra táticas algorítmicas de monitoramento e importunação, sem intenção real de diálogo.</w:t>
+      </w:r>
+    </w:p>
+    <w:p>
+      <w:pPr>
+        <w:numPr>
+          <w:ilvl w:val="0"/>
+          <w:numId w:val="8"/>
+        </w:numPr>
+      </w:pPr>
+      <w:r>
+        <w:rPr>
+          <w:b/>
+          <w:bCs/>
+        </w:rPr>
+        <w:t>Frequência e Padrão:</w:t>
+      </w:r>
+      <w:r>
+        <w:t xml:space="preserve"> Revela a automação. Provar matematicamente que ocorrem chamadas a cada 12 minutos, por exemplo, destrói o argumento bancário de "contato amigável" e configura cerco algorítmico.</w:t>
+      </w:r>
+    </w:p>
+    <w:p>
+      <w:r>
+        <w:rPr>
+          <w:b/>
+          <w:bCs/>
+        </w:rPr>
+        <w:t>O Diferencial do Perito:</w:t>
+      </w:r>
+      <w:r>
+        <w:t xml:space="preserve"> Como Doutor em Administração, minha análise não é apenas técnica, é comportamental. Eu transformo esses dados brutos em um </w:t>
+      </w:r>
+      <w:r>
+        <w:rPr>
+          <w:b/>
+          <w:bCs/>
+        </w:rPr>
+        <w:t>Relatório de Inviabilidade Humana</w:t>
+      </w:r>
+      <w:r>
+        <w:t>, demonstrando ao juiz, através da estatística da abusividade, que nenhum cidadão consegue manter sua produtividade, saúde mental ou vida social sob tal volume de ataques coordenados.</w:t>
+      </w:r>
+    </w:p>
+    <w:p>
+      <w:r>
+        <w:pict w14:anchorId="0EA2ECB5">
+          <v:rect id="_x0000_i1082" style="width:0;height:1.5pt" o:hralign="center" o:hrstd="t" o:hrnoshade="t" o:hr="t" fillcolor="gray" stroked="f"/>
+        </w:pict>
+      </w:r>
+    </w:p>
+    <w:p>
+      <w:pPr>
+        <w:rPr>
+          <w:b/>
+          <w:bCs/>
+        </w:rPr>
+      </w:pPr>
+      <w:r>
+        <w:rPr>
+          <w:rFonts w:ascii="Segoe UI Emoji" w:hAnsi="Segoe UI Emoji" w:cs="Segoe UI Emoji"/>
+          <w:b/>
+          <w:bCs/>
+        </w:rPr>
+        <w:t>🖥️</w:t>
+      </w:r>
+      <w:r>
+        <w:rPr>
+          <w:b/>
+          <w:bCs/>
+        </w:rPr>
+        <w:t xml:space="preserve"> CTA Estratégico (Meio de Funil)</w:t>
+      </w:r>
+    </w:p>
+    <w:p>
+      <w:pPr>
+        <w:rPr>
+          <w:b/>
+          <w:bCs/>
+        </w:rPr>
+      </w:pPr>
+      <w:r>
+        <w:rPr>
+          <w:b/>
+          <w:bCs/>
+        </w:rPr>
+        <w:t xml:space="preserve">Seu celular está tocando agora? Não apague nada. A prova do seu direito pode estar nessas ligações perdidas. </w:t>
+      </w:r>
+      <w:r>
+        <w:rPr>
+          <w:rFonts w:ascii="Segoe UI Emoji" w:hAnsi="Segoe UI Emoji" w:cs="Segoe UI Emoji"/>
+          <w:b/>
+          <w:bCs/>
+        </w:rPr>
+        <w:t>👉</w:t>
+      </w:r>
+      <w:r>
+        <w:rPr>
+          <w:b/>
+          <w:bCs/>
+        </w:rPr>
+        <w:t xml:space="preserve"> [Entenda como posso auditar seu histórico de chamadas]</w:t>
+      </w:r>
+    </w:p>
+    <w:p>
+      <w:pPr>
+        <w:rPr>
+          <w:b/>
+          <w:bCs/>
+        </w:rPr>
+      </w:pPr>
+      <w:r>
+        <w:rPr>
+          <w:b/>
+          <w:bCs/>
+        </w:rPr>
+        <w:t>2. Tabela Comparativa: Por que o "Print" Não Basta</w:t>
+      </w:r>
+    </w:p>
+    <w:p>
+      <w:r>
+        <w:t>Entenda por que depender apenas de capturas de tela (</w:t>
+      </w:r>
+      <w:r>
+        <w:rPr>
+          <w:i/>
+          <w:iCs/>
+        </w:rPr>
+        <w:t>prints</w:t>
+      </w:r>
+      <w:r>
+        <w:t>) pode enfraquecer drasticamente a sua causa e facilitar a contestação pelos advogados do banco:</w:t>
+      </w:r>
+    </w:p>
+    <w:tbl>
+      <w:tblPr>
+        <w:tblW w:w="0" w:type="auto"/>
+        <w:tblCellSpacing w:w="15" w:type="dxa"/>
+        <w:tblCellMar>
+          <w:left w:w="0" w:type="dxa"/>
+          <w:right w:w="0" w:type="dxa"/>
+        </w:tblCellMar>
+        <w:tblLook w:val="04A0" w:firstRow="1" w:lastRow="0" w:firstColumn="1" w:lastColumn="0" w:noHBand="0" w:noVBand="1"/>
+      </w:tblPr>
+      <w:tblGrid>
+        <w:gridCol w:w="1911"/>
+        <w:gridCol w:w="4035"/>
+        <w:gridCol w:w="4504"/>
+      </w:tblGrid>
+      <w:tr>
+        <w:trPr>
+          <w:tblHeader/>
+          <w:tblCellSpacing w:w="15" w:type="dxa"/>
+        </w:trPr>
+        <w:tc>
+          <w:tcPr>
+            <w:tcW w:w="0" w:type="auto"/>
+            <w:tcBorders>
+              <w:top w:val="single" w:sz="6" w:space="0" w:color="auto"/>
+              <w:left w:val="single" w:sz="6" w:space="0" w:color="auto"/>
+              <w:bottom w:val="single" w:sz="6" w:space="0" w:color="auto"/>
+              <w:right w:val="single" w:sz="6" w:space="0" w:color="auto"/>
+            </w:tcBorders>
+            <w:tcMar>
+              <w:top w:w="240" w:type="dxa"/>
+              <w:left w:w="0" w:type="dxa"/>
+              <w:bottom w:w="240" w:type="dxa"/>
+              <w:right w:w="180" w:type="dxa"/>
+            </w:tcMar>
+            <w:vAlign w:val="center"/>
+            <w:hideMark/>
+          </w:tcPr>
+          <w:p>
+            <w:r>
+              <w:rPr>
+                <w:b/>
+                <w:bCs/>
+              </w:rPr>
+              <w:t>Critério de Validade</w:t>
+            </w:r>
+          </w:p>
+        </w:tc>
+        <w:tc>
+          <w:tcPr>
+            <w:tcW w:w="0" w:type="auto"/>
+            <w:tcBorders>
+              <w:top w:val="single" w:sz="6" w:space="0" w:color="auto"/>
+              <w:left w:val="single" w:sz="6" w:space="0" w:color="auto"/>
+              <w:bottom w:val="single" w:sz="6" w:space="0" w:color="auto"/>
+              <w:right w:val="single" w:sz="6" w:space="0" w:color="auto"/>
+            </w:tcBorders>
+            <w:tcMar>
+              <w:top w:w="240" w:type="dxa"/>
+              <w:left w:w="0" w:type="dxa"/>
+              <w:bottom w:w="240" w:type="dxa"/>
+              <w:right w:w="180" w:type="dxa"/>
+            </w:tcMar>
+            <w:vAlign w:val="center"/>
+            <w:hideMark/>
+          </w:tcPr>
+          <w:p>
+            <w:r>
+              <w:rPr>
+                <w:b/>
+                <w:bCs/>
+              </w:rPr>
+              <w:t>Print de Tela (Captura Simples)</w:t>
+            </w:r>
+          </w:p>
+        </w:tc>
+        <w:tc>
+          <w:tcPr>
+            <w:tcW w:w="0" w:type="auto"/>
+            <w:tcBorders>
+              <w:top w:val="single" w:sz="6" w:space="0" w:color="auto"/>
+              <w:left w:val="single" w:sz="6" w:space="0" w:color="auto"/>
+              <w:bottom w:val="single" w:sz="6" w:space="0" w:color="auto"/>
+              <w:right w:val="single" w:sz="6" w:space="0" w:color="auto"/>
+            </w:tcBorders>
+            <w:tcMar>
+              <w:top w:w="240" w:type="dxa"/>
+              <w:left w:w="0" w:type="dxa"/>
+              <w:bottom w:w="240" w:type="dxa"/>
+              <w:right w:w="0" w:type="dxa"/>
+            </w:tcMar>
+            <w:vAlign w:val="center"/>
+            <w:hideMark/>
+          </w:tcPr>
+          <w:p>
+            <w:r>
+              <w:rPr>
+                <w:b/>
+                <w:bCs/>
+              </w:rPr>
+              <w:t>Perícia de Logs (Engenharia Forense de Dados)</w:t>
+            </w:r>
+          </w:p>
+        </w:tc>
+      </w:tr>
+      <w:tr>
+        <w:trPr>
+          <w:tblCellSpacing w:w="15" w:type="dxa"/>
+        </w:trPr>
+        <w:tc>
+          <w:tcPr>
+            <w:tcW w:w="0" w:type="auto"/>
+            <w:tcBorders>
+              <w:top w:val="single" w:sz="6" w:space="0" w:color="auto"/>
+              <w:left w:val="single" w:sz="6" w:space="0" w:color="auto"/>
+              <w:bottom w:val="single" w:sz="6" w:space="0" w:color="auto"/>
+              <w:right w:val="single" w:sz="6" w:space="0" w:color="auto"/>
+            </w:tcBorders>
+            <w:tcMar>
+              <w:top w:w="240" w:type="dxa"/>
+              <w:left w:w="0" w:type="dxa"/>
+              <w:bottom w:w="240" w:type="dxa"/>
+              <w:right w:w="180" w:type="dxa"/>
+            </w:tcMar>
+            <w:vAlign w:val="center"/>
+            <w:hideMark/>
+          </w:tcPr>
+          <w:p>
+            <w:r>
+              <w:rPr>
+                <w:b/>
+                <w:bCs/>
+              </w:rPr>
+              <w:t>Integridade</w:t>
+            </w:r>
+          </w:p>
+        </w:tc>
+        <w:tc>
+          <w:tcPr>
+            <w:tcW w:w="0" w:type="auto"/>
+            <w:tcBorders>
+              <w:top w:val="single" w:sz="6" w:space="0" w:color="auto"/>
+              <w:left w:val="single" w:sz="6" w:space="0" w:color="auto"/>
+              <w:bottom w:val="single" w:sz="6" w:space="0" w:color="auto"/>
+              <w:right w:val="single" w:sz="6" w:space="0" w:color="auto"/>
+            </w:tcBorders>
+            <w:tcMar>
+              <w:top w:w="240" w:type="dxa"/>
+              <w:left w:w="0" w:type="dxa"/>
+              <w:bottom w:w="240" w:type="dxa"/>
+              <w:right w:w="180" w:type="dxa"/>
+            </w:tcMar>
+            <w:vAlign w:val="center"/>
+            <w:hideMark/>
+          </w:tcPr>
+          <w:p>
+            <w:r>
+              <w:t>Baixa. Facilmente contestada, pois pode ser editada por apps ou Photoshop.</w:t>
+            </w:r>
+          </w:p>
+        </w:tc>
+        <w:tc>
+          <w:tcPr>
+            <w:tcW w:w="0" w:type="auto"/>
+            <w:tcBorders>
+              <w:top w:val="single" w:sz="6" w:space="0" w:color="auto"/>
+              <w:left w:val="single" w:sz="6" w:space="0" w:color="auto"/>
+              <w:bottom w:val="single" w:sz="6" w:space="0" w:color="auto"/>
+              <w:right w:val="single" w:sz="6" w:space="0" w:color="auto"/>
+            </w:tcBorders>
+            <w:tcMar>
+              <w:top w:w="240" w:type="dxa"/>
+              <w:left w:w="0" w:type="dxa"/>
+              <w:bottom w:w="240" w:type="dxa"/>
+              <w:right w:w="0" w:type="dxa"/>
+            </w:tcMar>
+            <w:vAlign w:val="center"/>
+            <w:hideMark/>
+          </w:tcPr>
+          <w:p>
+            <w:r>
+              <w:t xml:space="preserve">Altíssima. Auditável e verificada via </w:t>
+            </w:r>
+            <w:proofErr w:type="spellStart"/>
+            <w:r>
+              <w:rPr>
+                <w:b/>
+                <w:bCs/>
+              </w:rPr>
+              <w:t>Hash</w:t>
+            </w:r>
+            <w:proofErr w:type="spellEnd"/>
+            <w:r>
+              <w:t xml:space="preserve"> de segurança (garantindo que o dado é original do sistema).</w:t>
+            </w:r>
+          </w:p>
+        </w:tc>
+      </w:tr>
+      <w:tr>
+        <w:trPr>
+          <w:tblCellSpacing w:w="15" w:type="dxa"/>
+        </w:trPr>
+        <w:tc>
+          <w:tcPr>
+            <w:tcW w:w="0" w:type="auto"/>
+            <w:tcBorders>
+              <w:top w:val="single" w:sz="6" w:space="0" w:color="auto"/>
+              <w:left w:val="single" w:sz="6" w:space="0" w:color="auto"/>
+              <w:bottom w:val="single" w:sz="6" w:space="0" w:color="auto"/>
+              <w:right w:val="single" w:sz="6" w:space="0" w:color="auto"/>
+            </w:tcBorders>
+            <w:tcMar>
+              <w:top w:w="240" w:type="dxa"/>
+              <w:left w:w="0" w:type="dxa"/>
+              <w:bottom w:w="240" w:type="dxa"/>
+              <w:right w:w="180" w:type="dxa"/>
+            </w:tcMar>
+            <w:vAlign w:val="center"/>
+            <w:hideMark/>
+          </w:tcPr>
+          <w:p>
+            <w:r>
+              <w:rPr>
+                <w:b/>
+                <w:bCs/>
+              </w:rPr>
+              <w:lastRenderedPageBreak/>
+              <w:t>Profundidade</w:t>
+            </w:r>
+          </w:p>
+        </w:tc>
+        <w:tc>
+          <w:tcPr>
+            <w:tcW w:w="0" w:type="auto"/>
+            <w:tcBorders>
+              <w:top w:val="single" w:sz="6" w:space="0" w:color="auto"/>
+              <w:left w:val="single" w:sz="6" w:space="0" w:color="auto"/>
+              <w:bottom w:val="single" w:sz="6" w:space="0" w:color="auto"/>
+              <w:right w:val="single" w:sz="6" w:space="0" w:color="auto"/>
+            </w:tcBorders>
+            <w:tcMar>
+              <w:top w:w="240" w:type="dxa"/>
+              <w:left w:w="0" w:type="dxa"/>
+              <w:bottom w:w="240" w:type="dxa"/>
+              <w:right w:w="180" w:type="dxa"/>
+            </w:tcMar>
+            <w:vAlign w:val="center"/>
+            <w:hideMark/>
+          </w:tcPr>
+          <w:p>
+            <w:r>
+              <w:t>Superficial. Mostra apenas o que aparece na tela (nome salvo ou número mascarado).</w:t>
+            </w:r>
+          </w:p>
+        </w:tc>
+        <w:tc>
+          <w:tcPr>
+            <w:tcW w:w="0" w:type="auto"/>
+            <w:tcBorders>
+              <w:top w:val="single" w:sz="6" w:space="0" w:color="auto"/>
+              <w:left w:val="single" w:sz="6" w:space="0" w:color="auto"/>
+              <w:bottom w:val="single" w:sz="6" w:space="0" w:color="auto"/>
+              <w:right w:val="single" w:sz="6" w:space="0" w:color="auto"/>
+            </w:tcBorders>
+            <w:tcMar>
+              <w:top w:w="240" w:type="dxa"/>
+              <w:left w:w="0" w:type="dxa"/>
+              <w:bottom w:w="240" w:type="dxa"/>
+              <w:right w:w="0" w:type="dxa"/>
+            </w:tcMar>
+            <w:vAlign w:val="center"/>
+            <w:hideMark/>
+          </w:tcPr>
+          <w:p>
+            <w:r>
+              <w:t>Profunda. Revela a origem técnica (VoIP, rotas de discagem), operadora de origem e metadados ocultos do sistema operacional.</w:t>
+            </w:r>
+          </w:p>
+        </w:tc>
+      </w:tr>
+      <w:tr>
+        <w:trPr>
+          <w:tblCellSpacing w:w="15" w:type="dxa"/>
+        </w:trPr>
+        <w:tc>
+          <w:tcPr>
+            <w:tcW w:w="0" w:type="auto"/>
+            <w:tcBorders>
+              <w:top w:val="single" w:sz="6" w:space="0" w:color="auto"/>
+              <w:left w:val="single" w:sz="6" w:space="0" w:color="auto"/>
+              <w:bottom w:val="single" w:sz="6" w:space="0" w:color="auto"/>
+              <w:right w:val="single" w:sz="6" w:space="0" w:color="auto"/>
+            </w:tcBorders>
+            <w:tcMar>
+              <w:top w:w="240" w:type="dxa"/>
+              <w:left w:w="0" w:type="dxa"/>
+              <w:bottom w:w="240" w:type="dxa"/>
+              <w:right w:w="180" w:type="dxa"/>
+            </w:tcMar>
+            <w:vAlign w:val="center"/>
+            <w:hideMark/>
+          </w:tcPr>
+          <w:p>
+            <w:r>
+              <w:rPr>
+                <w:b/>
+                <w:bCs/>
+              </w:rPr>
+              <w:t>Aceitação Judicial</w:t>
+            </w:r>
+          </w:p>
+        </w:tc>
+        <w:tc>
+          <w:tcPr>
+            <w:tcW w:w="0" w:type="auto"/>
+            <w:tcBorders>
+              <w:top w:val="single" w:sz="6" w:space="0" w:color="auto"/>
+              <w:left w:val="single" w:sz="6" w:space="0" w:color="auto"/>
+              <w:bottom w:val="single" w:sz="6" w:space="0" w:color="auto"/>
+              <w:right w:val="single" w:sz="6" w:space="0" w:color="auto"/>
+            </w:tcBorders>
+            <w:tcMar>
+              <w:top w:w="240" w:type="dxa"/>
+              <w:left w:w="0" w:type="dxa"/>
+              <w:bottom w:w="240" w:type="dxa"/>
+              <w:right w:w="180" w:type="dxa"/>
+            </w:tcMar>
+            <w:vAlign w:val="center"/>
+            <w:hideMark/>
+          </w:tcPr>
+          <w:p>
+            <w:r>
+              <w:t>Prova indiciária (fraca). Frequentemente considerada insuficiente como prova única do dano.</w:t>
+            </w:r>
+          </w:p>
+        </w:tc>
+        <w:tc>
+          <w:tcPr>
+            <w:tcW w:w="0" w:type="auto"/>
+            <w:tcBorders>
+              <w:top w:val="single" w:sz="6" w:space="0" w:color="auto"/>
+              <w:left w:val="single" w:sz="6" w:space="0" w:color="auto"/>
+              <w:bottom w:val="single" w:sz="6" w:space="0" w:color="auto"/>
+              <w:right w:val="single" w:sz="6" w:space="0" w:color="auto"/>
+            </w:tcBorders>
+            <w:tcMar>
+              <w:top w:w="240" w:type="dxa"/>
+              <w:left w:w="0" w:type="dxa"/>
+              <w:bottom w:w="240" w:type="dxa"/>
+              <w:right w:w="0" w:type="dxa"/>
+            </w:tcMar>
+            <w:vAlign w:val="center"/>
+            <w:hideMark/>
+          </w:tcPr>
+          <w:p>
+            <w:r>
+              <w:rPr>
+                <w:b/>
+                <w:bCs/>
+              </w:rPr>
+              <w:t>Prova Material Robusta</w:t>
+            </w:r>
+            <w:r>
+              <w:t>. De difícil contestação técnica, gerando Certeza Técnica ao magistrado.</w:t>
+            </w:r>
+          </w:p>
+        </w:tc>
+      </w:tr>
+      <w:tr>
+        <w:trPr>
+          <w:tblCellSpacing w:w="15" w:type="dxa"/>
+        </w:trPr>
+        <w:tc>
+          <w:tcPr>
+            <w:tcW w:w="0" w:type="auto"/>
+            <w:tcBorders>
+              <w:top w:val="single" w:sz="6" w:space="0" w:color="auto"/>
+              <w:left w:val="single" w:sz="6" w:space="0" w:color="auto"/>
+              <w:bottom w:val="single" w:sz="6" w:space="0" w:color="auto"/>
+              <w:right w:val="single" w:sz="6" w:space="0" w:color="auto"/>
+            </w:tcBorders>
+            <w:tcMar>
+              <w:top w:w="240" w:type="dxa"/>
+              <w:left w:w="0" w:type="dxa"/>
+              <w:bottom w:w="240" w:type="dxa"/>
+              <w:right w:w="180" w:type="dxa"/>
+            </w:tcMar>
+            <w:vAlign w:val="center"/>
+            <w:hideMark/>
+          </w:tcPr>
+          <w:p>
+            <w:r>
+              <w:rPr>
+                <w:b/>
+                <w:bCs/>
+              </w:rPr>
+              <w:t>Nexo Causal</w:t>
+            </w:r>
+          </w:p>
+        </w:tc>
+        <w:tc>
+          <w:tcPr>
+            <w:tcW w:w="0" w:type="auto"/>
+            <w:tcBorders>
+              <w:top w:val="single" w:sz="6" w:space="0" w:color="auto"/>
+              <w:left w:val="single" w:sz="6" w:space="0" w:color="auto"/>
+              <w:bottom w:val="single" w:sz="6" w:space="0" w:color="auto"/>
+              <w:right w:val="single" w:sz="6" w:space="0" w:color="auto"/>
+            </w:tcBorders>
+            <w:tcMar>
+              <w:top w:w="240" w:type="dxa"/>
+              <w:left w:w="0" w:type="dxa"/>
+              <w:bottom w:w="240" w:type="dxa"/>
+              <w:right w:w="180" w:type="dxa"/>
+            </w:tcMar>
+            <w:vAlign w:val="center"/>
+            <w:hideMark/>
+          </w:tcPr>
+          <w:p>
+            <w:r>
+              <w:t>Baseado no relato subjetivo do usuário sobre o incômodo.</w:t>
+            </w:r>
+          </w:p>
+        </w:tc>
+        <w:tc>
+          <w:tcPr>
+            <w:tcW w:w="0" w:type="auto"/>
+            <w:tcBorders>
+              <w:top w:val="single" w:sz="6" w:space="0" w:color="auto"/>
+              <w:left w:val="single" w:sz="6" w:space="0" w:color="auto"/>
+              <w:bottom w:val="single" w:sz="6" w:space="0" w:color="auto"/>
+              <w:right w:val="single" w:sz="6" w:space="0" w:color="auto"/>
+            </w:tcBorders>
+            <w:tcMar>
+              <w:top w:w="240" w:type="dxa"/>
+              <w:left w:w="0" w:type="dxa"/>
+              <w:bottom w:w="240" w:type="dxa"/>
+              <w:right w:w="0" w:type="dxa"/>
+            </w:tcMar>
+            <w:vAlign w:val="center"/>
+            <w:hideMark/>
+          </w:tcPr>
+          <w:p>
+            <w:r>
+              <w:t xml:space="preserve">Baseado em </w:t>
+            </w:r>
+            <w:r>
+              <w:rPr>
+                <w:b/>
+                <w:bCs/>
+              </w:rPr>
+              <w:t>Estatística Forense</w:t>
+            </w:r>
+            <w:r>
+              <w:t>. Prova objetiva do padrão abusivo e do desvio produtivo do consumidor.</w:t>
+            </w:r>
+          </w:p>
+        </w:tc>
+      </w:tr>
+    </w:tbl>
+    <w:p>
+      <w:pPr>
+        <w:rPr>
+          <w:b/>
+          <w:bCs/>
+        </w:rPr>
+      </w:pPr>
+      <w:r>
+        <w:rPr>
+          <w:b/>
+          <w:bCs/>
+        </w:rPr>
+        <w:t>3. A Visão do Perito: Cadeia de Custódia (ISOhttps://www.google.com/search?q=/IEC 27037)</w:t>
+      </w:r>
+    </w:p>
+    <w:p>
+      <w:r>
+        <w:t>A transformação de um dado em prova judicial segue ritos rigorosos. A extração de dados de um smartphone não pode ser feita de qualquer maneira ("</w:t>
+      </w:r>
+      <w:proofErr w:type="spellStart"/>
+      <w:r>
+        <w:t>copyhttps</w:t>
+      </w:r>
+      <w:proofErr w:type="spellEnd"/>
+      <w:r>
+        <w:t>://www.google.com/</w:t>
+      </w:r>
+      <w:proofErr w:type="spellStart"/>
+      <w:r>
+        <w:t>search?q</w:t>
+      </w:r>
+      <w:proofErr w:type="spellEnd"/>
+      <w:r>
+        <w:t xml:space="preserve">=/paste" ou </w:t>
+      </w:r>
+      <w:r>
+        <w:rPr>
+          <w:i/>
+          <w:iCs/>
+        </w:rPr>
+        <w:t>backup</w:t>
+      </w:r>
+      <w:r>
+        <w:t xml:space="preserve"> comum).</w:t>
+      </w:r>
+    </w:p>
+    <w:p>
+      <w:r>
+        <w:t xml:space="preserve">Como perito, sigo rigorosamente as normas internacionais de preservação de evidências digitais (ISOhttps://www.google.com/search?q=/IEC 27037) para garantir a </w:t>
+      </w:r>
+      <w:r>
+        <w:rPr>
+          <w:b/>
+          <w:bCs/>
+        </w:rPr>
+        <w:t>Cadeia de Custódia</w:t>
+      </w:r>
+      <w:r>
+        <w:t>.</w:t>
+      </w:r>
+    </w:p>
+    <w:p>
+      <w:r>
+        <w:rPr>
+          <w:b/>
+          <w:bCs/>
+        </w:rPr>
+        <w:t>Um alerta vital:</w:t>
+      </w:r>
+      <w:r>
+        <w:t xml:space="preserve"> Se você, na tentativa de se livrar do incômodo, apagar as chamadas ou utilizar apps para "limpar o cache", você pode estar </w:t>
+      </w:r>
+      <w:r>
+        <w:rPr>
+          <w:b/>
+          <w:bCs/>
+        </w:rPr>
+        <w:t>destruindo a prova material</w:t>
+      </w:r>
+      <w:r>
+        <w:t xml:space="preserve"> que garantiria sua indenização. A organização dos dados deve seguir uma linha do tempo lógica que correlacione o assédio à violação direta do Artigo 42 do Código de Defesa do Consumidor (CDC).</w:t>
+      </w:r>
+    </w:p>
+    <w:p>
+      <w:pPr>
+        <w:rPr>
+          <w:b/>
+          <w:bCs/>
+        </w:rPr>
+      </w:pPr>
+      <w:r>
+        <w:rPr>
+          <w:b/>
+          <w:bCs/>
+        </w:rPr>
+        <w:t>4. Checklist: Como Organizar Seus Dados HOJE (Diligência Preventiva)</w:t>
+      </w:r>
+    </w:p>
+    <w:p>
+      <w:r>
+        <w:t>Não espere o processo começar para cuidar da sua prova. Siga este protocolo de diligência pericial imediatamente:</w:t>
+      </w:r>
+    </w:p>
+    <w:p>
+      <w:pPr>
+        <w:numPr>
+          <w:ilvl w:val="0"/>
+          <w:numId w:val="9"/>
+        </w:numPr>
+      </w:pPr>
+      <w:r>
+        <w:rPr>
+          <w:b/>
+          <w:bCs/>
+        </w:rPr>
+        <w:t>[ ] NÃO APAGUE O HISTÓRICO:</w:t>
+      </w:r>
+      <w:r>
+        <w:t xml:space="preserve"> Trate seu celular como uma cena de crime. Mesmo números "estranhos", "desconhecidos" ou marcados como SPAM são peças essenciais do quebra-cabeça estatístico.</w:t>
+      </w:r>
+    </w:p>
+    <w:p>
+      <w:pPr>
+        <w:numPr>
+          <w:ilvl w:val="0"/>
+          <w:numId w:val="9"/>
+        </w:numPr>
+      </w:pPr>
+      <w:r>
+        <w:rPr>
+          <w:b/>
+          <w:bCs/>
+        </w:rPr>
+        <w:t>[ ] VÍDEO DE "SCROLL":</w:t>
+      </w:r>
+      <w:r>
+        <w:t xml:space="preserve"> Grave a tela do seu celular (usando outro aparelho ou gravador de tela nativo) rolando lentamente a lista de chamadas. Isso serve como um registro visual preliminar da extensão do abuso antes da perícia técnica.</w:t>
+      </w:r>
+    </w:p>
+    <w:p>
+      <w:pPr>
+        <w:numPr>
+          <w:ilvl w:val="0"/>
+          <w:numId w:val="9"/>
+        </w:numPr>
+      </w:pPr>
+      <w:r>
+        <w:rPr>
+          <w:b/>
+          <w:bCs/>
+        </w:rPr>
+        <w:lastRenderedPageBreak/>
+        <w:t>[ ] SOLICITE RELATÓRIO DA OPERADORA:</w:t>
+      </w:r>
+      <w:r>
+        <w:t xml:space="preserve"> Peça o detalhamento de chamadas recebidas. Atenção: nem sempre as operadoras fornecem o registro de chamadas "não atendidas" ou recusadas, por isso o log nativo do aparelho (extraído </w:t>
+      </w:r>
+      <w:proofErr w:type="spellStart"/>
+      <w:r>
+        <w:t>forensicamente</w:t>
+      </w:r>
+      <w:proofErr w:type="spellEnd"/>
+      <w:r>
+        <w:t>) é vital.</w:t>
+      </w:r>
+    </w:p>
+    <w:p>
+      <w:pPr>
+        <w:numPr>
+          <w:ilvl w:val="0"/>
+          <w:numId w:val="9"/>
+        </w:numPr>
+      </w:pPr>
+      <w:r>
+        <w:rPr>
+          <w:b/>
+          <w:bCs/>
+        </w:rPr>
+        <w:t>[ ] GARANTA BACKUP SEGURO:</w:t>
+      </w:r>
+      <w:r>
+        <w:t xml:space="preserve"> Certifique-se de que os dados do sistema não sejam subscritos por atualizações automáticas ou falta de espaço.</w:t>
+      </w:r>
+    </w:p>
+    <w:p>
+      <w:pPr>
+        <w:rPr>
+          <w:b/>
+          <w:bCs/>
+        </w:rPr>
+      </w:pPr>
+      <w:r>
+        <w:rPr>
+          <w:b/>
+          <w:bCs/>
+        </w:rPr>
+        <w:t>5. Quesitos Estratégicos para o Seu Advogado</w:t>
+      </w:r>
+    </w:p>
+    <w:p>
+      <w:r>
+        <w:t>Para que a Engenharia Forense de Dados tenha eficácia total no processo, seu advogado deve formular quesitos precisos ao perito judicial. Aqui estão exemplos de quesitos que eu, como perito, estou habilitado a responder com certeza técnica:</w:t>
+      </w:r>
+    </w:p>
+    <w:p>
+      <w:pPr>
+        <w:numPr>
+          <w:ilvl w:val="0"/>
+          <w:numId w:val="10"/>
+        </w:numPr>
+      </w:pPr>
+      <w:r>
+        <w:rPr>
+          <w:i/>
+          <w:iCs/>
+        </w:rPr>
+        <w:t>Queira o Sr. Perito confirmar se os metadados dos logs de chamadas extraídos do dispositivo da parte Autora apresentam integridade técnica, rastreabilidade e ausência de manipulação manual, conforme normas da ISOhttps://www.google.com/search?q=/IEC 27037?</w:t>
+      </w:r>
+    </w:p>
+    <w:p>
+      <w:pPr>
+        <w:numPr>
+          <w:ilvl w:val="0"/>
+          <w:numId w:val="10"/>
+        </w:numPr>
+      </w:pPr>
+      <w:r>
+        <w:rPr>
+          <w:i/>
+          <w:iCs/>
+        </w:rPr>
+        <w:t xml:space="preserve">Pode a perícia identificar, através da análise estatística dos </w:t>
+      </w:r>
+      <w:proofErr w:type="spellStart"/>
+      <w:r>
+        <w:rPr>
+          <w:i/>
+          <w:iCs/>
+        </w:rPr>
+        <w:t>timestamps</w:t>
+      </w:r>
+      <w:proofErr w:type="spellEnd"/>
+      <w:r>
+        <w:rPr>
+          <w:i/>
+          <w:iCs/>
+        </w:rPr>
+        <w:t>, se a frequência e o intervalo entre as chamadas sugerem a utilização de discadores automáticos (robôs) em detrimento da discagem humana, configurando importunação sistêmica?</w:t>
+      </w:r>
+    </w:p>
+    <w:p>
+      <w:r>
+        <w:pict w14:anchorId="1B5FA4D0">
+          <v:rect id="_x0000_i1083" style="width:0;height:1.5pt" o:hralign="center" o:hrstd="t" o:hrnoshade="t" o:hr="t" fillcolor="gray" stroked="f"/>
+        </w:pict>
+      </w:r>
+    </w:p>
+    <w:p>
+      <w:pPr>
+        <w:rPr>
+          <w:b/>
+          <w:bCs/>
+        </w:rPr>
+      </w:pPr>
+      <w:r>
+        <w:rPr>
+          <w:rFonts w:ascii="Segoe UI Emoji" w:hAnsi="Segoe UI Emoji" w:cs="Segoe UI Emoji"/>
+          <w:b/>
+          <w:bCs/>
+        </w:rPr>
+        <w:t>⚖️</w:t>
+      </w:r>
+      <w:r>
+        <w:rPr>
+          <w:b/>
+          <w:bCs/>
+        </w:rPr>
+        <w:t xml:space="preserve"> Nota de Rigor Técnico e Lisura</w:t>
+      </w:r>
+    </w:p>
+    <w:p>
+      <w:r>
+        <w:t xml:space="preserve">Este artigo foi elaborado sob a ótica da </w:t>
+      </w:r>
+      <w:r>
+        <w:rPr>
+          <w:b/>
+          <w:bCs/>
+        </w:rPr>
+        <w:t>Diligência Pericial</w:t>
+      </w:r>
+      <w:r>
+        <w:t xml:space="preserve">, respeitando estritamente as diretrizes de proteção de dados (LGPD) e as normas de prova digital do Código de Processo Civil (CPC). Como Dr. em Administração e Analista de Sistemas, assevero que a metodologia aqui descrita visa conferir </w:t>
+      </w:r>
+      <w:r>
+        <w:rPr>
+          <w:b/>
+          <w:bCs/>
+        </w:rPr>
+        <w:t>Certeza Técnica</w:t>
+      </w:r>
+      <w:r>
+        <w:t xml:space="preserve"> ao magistrado, transformando a dor subjetiva do assédio em uma evidência matemática inquestionável de abuso de direito.</w:t>
+      </w:r>
+    </w:p>
+    <w:p>
+      <w:r>
+        <w:pict w14:anchorId="3F4276DC">
+          <v:rect id="_x0000_i1084" style="width:0;height:1.5pt" o:hralign="center" o:hrstd="t" o:hrnoshade="t" o:hr="t" fillcolor="gray" stroked="f"/>
+        </w:pict>
+      </w:r>
+    </w:p>
+    <w:p>
+      <w:pPr>
+        <w:rPr>
+          <w:b/>
+          <w:bCs/>
+        </w:rPr>
+      </w:pPr>
+      <w:r>
+        <w:rPr>
+          <w:b/>
+          <w:bCs/>
+        </w:rPr>
+        <w:t>Conclusão: Seus Dados Precisam de Voz</w:t>
+      </w:r>
+    </w:p>
+    <w:p>
+      <w:r>
+        <w:t>Seu celular guarda a prova irrefutável de que o banco cruzou a linha do fomento mercantil e entrou na esfera da coação ilegal.</w:t>
+      </w:r>
+    </w:p>
+    <w:p>
+      <w:r>
+        <w:t>Não deixe que esses dados preciosos se percam no tempo ou sejam apagados por impulso. Organizar tecnicamente o log de chamadas é o primeiro e mais importante passo para transformar o seu incômodo em uma sentença favorável. A perícia técnica de dados é a voz que as suas evidências precisam ter dentro do tribunal.</w:t>
+      </w:r>
+    </w:p>
+    <w:p>
+      <w:r>
+        <w:pict w14:anchorId="73D6B1B5">
+          <v:rect id="_x0000_i1085" style="width:0;height:1.5pt" o:hralign="center" o:hrstd="t" o:hrnoshade="t" o:hr="t" fillcolor="gray" stroked="f"/>
+        </w:pict>
+      </w:r>
+    </w:p>
+    <w:p>
+      <w:pPr>
+        <w:rPr>
+          <w:b/>
+          <w:bCs/>
+        </w:rPr>
+      </w:pPr>
+      <w:r>
+        <w:rPr>
+          <w:rFonts w:ascii="Segoe UI Emoji" w:hAnsi="Segoe UI Emoji" w:cs="Segoe UI Emoji"/>
+          <w:b/>
+          <w:bCs/>
+        </w:rPr>
+        <w:t>🎯</w:t>
+      </w:r>
+      <w:r>
+        <w:rPr>
+          <w:b/>
+          <w:bCs/>
+        </w:rPr>
+        <w:t xml:space="preserve"> CTA FINAL - ALTA CONVERSÃO (Ouro)</w:t>
+      </w:r>
+    </w:p>
+    <w:p>
+      <w:pPr>
+        <w:rPr>
+          <w:b/>
+          <w:bCs/>
+        </w:rPr>
+      </w:pPr>
+      <w:r>
+        <w:rPr>
+          <w:b/>
+          <w:bCs/>
+        </w:rPr>
+        <w:t xml:space="preserve">Proteja sua prova agora. Não deixe que o banco apague o rastro do abuso. </w:t>
+      </w:r>
+      <w:r>
+        <w:rPr>
+          <w:rFonts w:ascii="Segoe UI Emoji" w:hAnsi="Segoe UI Emoji" w:cs="Segoe UI Emoji"/>
+          <w:b/>
+          <w:bCs/>
+        </w:rPr>
+        <w:t>👉</w:t>
+      </w:r>
+      <w:r>
+        <w:rPr>
+          <w:b/>
+          <w:bCs/>
+        </w:rPr>
+        <w:t xml:space="preserve"> [QUERO TRANSFORMAR MEUS LOGS EM PROVA JUDICIAL IRREFUTÁVEL] </w:t>
+      </w:r>
+      <w:r>
+        <w:rPr>
+          <w:b/>
+          <w:bCs/>
+          <w:i/>
+          <w:iCs/>
+        </w:rPr>
+        <w:t>(Link para página de contatohttps://www.google.com/search?q=/agendamento com o assunto pré-definido: "Perícia de Logs de Chamadas")</w:t>
       </w:r>
     </w:p>
     <w:p/>
@@ -1458,6 +2986,119 @@
 <file path=word/numbering.xml><?xml version="1.0" encoding="utf-8"?>
 <w:numbering xmlns:wpc="http://schemas.microsoft.com/office/word/2010/wordprocessingCanvas" xmlns:cx="http://schemas.microsoft.com/office/drawing/2014/chartex" xmlns:cx1="http://schemas.microsoft.com/office/drawing/2015/9/8/chartex" xmlns:cx2="http://schemas.microsoft.com/office/drawing/2015/10/21/chartex" xmlns:cx3="http://schemas.microsoft.com/office/drawing/2016/5/9/chartex" xmlns:cx4="http://schemas.microsoft.com/office/drawing/2016/5/10/chartex" xmlns:cx5="http://schemas.microsoft.com/office/drawing/2016/5/11/chartex" xmlns:cx6="http://schemas.microsoft.com/office/drawing/2016/5/12/chartex" xmlns:cx7="http://schemas.microsoft.com/office/drawing/2016/5/13/chartex" xmlns:cx8="http://schemas.microsoft.com/office/drawing/2016/5/14/chartex" xmlns:mc="http://schemas.openxmlformats.org/markup-compatibility/2006" xmlns:aink="http://schemas.microsoft.com/office/drawing/2016/ink" xmlns:am3d="http://schemas.microsoft.com/office/drawing/2017/model3d" xmlns:o="urn:schemas-microsoft-com:office:office" xmlns:oel="http://schemas.microsoft.com/office/2019/extlst" xmlns:r="http://schemas.openxmlformats.org/officeDocument/2006/relationships" xmlns:m="http://schemas.openxmlformats.org/officeDocument/2006/math" xmlns:v="urn:schemas-microsoft-com:vml" xmlns:wp14="http://schemas.microsoft.com/office/word/2010/wordprocessingDrawing" xmlns:wp="http://schemas.openxmlformats.org/drawingml/2006/wordprocessingDrawing" xmlns:w10="urn:schemas-microsoft-com:office:word" xmlns:w="http://schemas.openxmlformats.org/wordprocessingml/2006/main" xmlns:w14="http://schemas.microsoft.com/office/word/2010/wordml" xmlns:w15="http://schemas.microsoft.com/office/word/2012/wordml" xmlns:w16cex="http://schemas.microsoft.com/office/word/2018/wordml/cex" xmlns:w16cid="http://schemas.microsoft.com/office/word/2016/wordml/cid" xmlns:w16="http://schemas.microsoft.com/office/word/2018/wordml" xmlns:w16du="http://schemas.microsoft.com/office/word/2023/wordml/word16du" xmlns:w16sdtdh="http://schemas.microsoft.com/office/word/2020/wordml/sdtdatahash" xmlns:w16sdtfl="http://schemas.microsoft.com/office/word/2024/wordml/sdtformatlock" xmlns:w16se="http://schemas.microsoft.com/office/word/2015/wordml/symex" xmlns:wpg="http://schemas.microsoft.com/office/word/2010/wordprocessingGroup" xmlns:wpi="http://schemas.microsoft.com/office/word/2010/wordprocessingInk" xmlns:wne="http://schemas.microsoft.com/office/word/2006/wordml" xmlns:wps="http://schemas.microsoft.com/office/word/2010/wordprocessingShape" mc:Ignorable="w14 w15 w16se w16cid w16 w16cex w16sdtdh w16sdtfl w16du wp14">
   <w:abstractNum w:abstractNumId="0" w15:restartNumberingAfterBreak="0">
+    <w:nsid w:val="0F137FC7"/>
+    <w:multiLevelType w:val="multilevel"/>
+    <w:tmpl w:val="854C394A"/>
+    <w:lvl w:ilvl="0">
+      <w:start w:val="1"/>
+      <w:numFmt w:val="decimal"/>
+      <w:lvlText w:val="%1."/>
+      <w:lvlJc w:val="left"/>
+      <w:pPr>
+        <w:tabs>
+          <w:tab w:val="num" w:pos="720"/>
+        </w:tabs>
+        <w:ind w:left="720" w:hanging="360"/>
+      </w:pPr>
+    </w:lvl>
+    <w:lvl w:ilvl="1" w:tentative="1">
+      <w:start w:val="1"/>
+      <w:numFmt w:val="decimal"/>
+      <w:lvlText w:val="%2."/>
+      <w:lvlJc w:val="left"/>
+      <w:pPr>
+        <w:tabs>
+          <w:tab w:val="num" w:pos="1440"/>
+        </w:tabs>
+        <w:ind w:left="1440" w:hanging="360"/>
+      </w:pPr>
+    </w:lvl>
+    <w:lvl w:ilvl="2" w:tentative="1">
+      <w:start w:val="1"/>
+      <w:numFmt w:val="decimal"/>
+      <w:lvlText w:val="%3."/>
+      <w:lvlJc w:val="left"/>
+      <w:pPr>
+        <w:tabs>
+          <w:tab w:val="num" w:pos="2160"/>
+        </w:tabs>
+        <w:ind w:left="2160" w:hanging="360"/>
+      </w:pPr>
+    </w:lvl>
+    <w:lvl w:ilvl="3" w:tentative="1">
+      <w:start w:val="1"/>
+      <w:numFmt w:val="decimal"/>
+      <w:lvlText w:val="%4."/>
+      <w:lvlJc w:val="left"/>
+      <w:pPr>
+        <w:tabs>
+          <w:tab w:val="num" w:pos="2880"/>
+        </w:tabs>
+        <w:ind w:left="2880" w:hanging="360"/>
+      </w:pPr>
+    </w:lvl>
+    <w:lvl w:ilvl="4" w:tentative="1">
+      <w:start w:val="1"/>
+      <w:numFmt w:val="decimal"/>
+      <w:lvlText w:val="%5."/>
+      <w:lvlJc w:val="left"/>
+      <w:pPr>
+        <w:tabs>
+          <w:tab w:val="num" w:pos="3600"/>
+        </w:tabs>
+        <w:ind w:left="3600" w:hanging="360"/>
+      </w:pPr>
+    </w:lvl>
+    <w:lvl w:ilvl="5" w:tentative="1">
+      <w:start w:val="1"/>
+      <w:numFmt w:val="decimal"/>
+      <w:lvlText w:val="%6."/>
+      <w:lvlJc w:val="left"/>
+      <w:pPr>
+        <w:tabs>
+          <w:tab w:val="num" w:pos="4320"/>
+        </w:tabs>
+        <w:ind w:left="4320" w:hanging="360"/>
+      </w:pPr>
+    </w:lvl>
+    <w:lvl w:ilvl="6" w:tentative="1">
+      <w:start w:val="1"/>
+      <w:numFmt w:val="decimal"/>
+      <w:lvlText w:val="%7."/>
+      <w:lvlJc w:val="left"/>
+      <w:pPr>
+        <w:tabs>
+          <w:tab w:val="num" w:pos="5040"/>
+        </w:tabs>
+        <w:ind w:left="5040" w:hanging="360"/>
+      </w:pPr>
+    </w:lvl>
+    <w:lvl w:ilvl="7" w:tentative="1">
+      <w:start w:val="1"/>
+      <w:numFmt w:val="decimal"/>
+      <w:lvlText w:val="%8."/>
+      <w:lvlJc w:val="left"/>
+      <w:pPr>
+        <w:tabs>
+          <w:tab w:val="num" w:pos="5760"/>
+        </w:tabs>
+        <w:ind w:left="5760" w:hanging="360"/>
+      </w:pPr>
+    </w:lvl>
+    <w:lvl w:ilvl="8" w:tentative="1">
+      <w:start w:val="1"/>
+      <w:numFmt w:val="decimal"/>
+      <w:lvlText w:val="%9."/>
+      <w:lvlJc w:val="left"/>
+      <w:pPr>
+        <w:tabs>
+          <w:tab w:val="num" w:pos="6480"/>
+        </w:tabs>
+        <w:ind w:left="6480" w:hanging="360"/>
+      </w:pPr>
+    </w:lvl>
+  </w:abstractNum>
+  <w:abstractNum w:abstractNumId="1" w15:restartNumberingAfterBreak="0">
     <w:nsid w:val="111E60C4"/>
     <w:multiLevelType w:val="multilevel"/>
     <w:tmpl w:val="209C6CB4"/>
@@ -1606,7 +3247,7 @@
       </w:rPr>
     </w:lvl>
   </w:abstractNum>
-  <w:abstractNum w:abstractNumId="1" w15:restartNumberingAfterBreak="0">
+  <w:abstractNum w:abstractNumId="2" w15:restartNumberingAfterBreak="0">
     <w:nsid w:val="292B010D"/>
     <w:multiLevelType w:val="multilevel"/>
     <w:tmpl w:val="E80A89FC"/>
@@ -1755,7 +3396,7 @@
       </w:rPr>
     </w:lvl>
   </w:abstractNum>
-  <w:abstractNum w:abstractNumId="2" w15:restartNumberingAfterBreak="0">
+  <w:abstractNum w:abstractNumId="3" w15:restartNumberingAfterBreak="0">
     <w:nsid w:val="2EF074A8"/>
     <w:multiLevelType w:val="multilevel"/>
     <w:tmpl w:val="6354EEEC"/>
@@ -1904,7 +3545,269 @@
       </w:rPr>
     </w:lvl>
   </w:abstractNum>
-  <w:abstractNum w:abstractNumId="3" w15:restartNumberingAfterBreak="0">
+  <w:abstractNum w:abstractNumId="4" w15:restartNumberingAfterBreak="0">
+    <w:nsid w:val="30393B0D"/>
+    <w:multiLevelType w:val="multilevel"/>
+    <w:tmpl w:val="459CC0AA"/>
+    <w:lvl w:ilvl="0">
+      <w:start w:val="1"/>
+      <w:numFmt w:val="decimal"/>
+      <w:lvlText w:val="%1."/>
+      <w:lvlJc w:val="left"/>
+      <w:pPr>
+        <w:tabs>
+          <w:tab w:val="num" w:pos="720"/>
+        </w:tabs>
+        <w:ind w:left="720" w:hanging="360"/>
+      </w:pPr>
+    </w:lvl>
+    <w:lvl w:ilvl="1" w:tentative="1">
+      <w:start w:val="1"/>
+      <w:numFmt w:val="decimal"/>
+      <w:lvlText w:val="%2."/>
+      <w:lvlJc w:val="left"/>
+      <w:pPr>
+        <w:tabs>
+          <w:tab w:val="num" w:pos="1440"/>
+        </w:tabs>
+        <w:ind w:left="1440" w:hanging="360"/>
+      </w:pPr>
+    </w:lvl>
+    <w:lvl w:ilvl="2" w:tentative="1">
+      <w:start w:val="1"/>
+      <w:numFmt w:val="decimal"/>
+      <w:lvlText w:val="%3."/>
+      <w:lvlJc w:val="left"/>
+      <w:pPr>
+        <w:tabs>
+          <w:tab w:val="num" w:pos="2160"/>
+        </w:tabs>
+        <w:ind w:left="2160" w:hanging="360"/>
+      </w:pPr>
+    </w:lvl>
+    <w:lvl w:ilvl="3" w:tentative="1">
+      <w:start w:val="1"/>
+      <w:numFmt w:val="decimal"/>
+      <w:lvlText w:val="%4."/>
+      <w:lvlJc w:val="left"/>
+      <w:pPr>
+        <w:tabs>
+          <w:tab w:val="num" w:pos="2880"/>
+        </w:tabs>
+        <w:ind w:left="2880" w:hanging="360"/>
+      </w:pPr>
+    </w:lvl>
+    <w:lvl w:ilvl="4" w:tentative="1">
+      <w:start w:val="1"/>
+      <w:numFmt w:val="decimal"/>
+      <w:lvlText w:val="%5."/>
+      <w:lvlJc w:val="left"/>
+      <w:pPr>
+        <w:tabs>
+          <w:tab w:val="num" w:pos="3600"/>
+        </w:tabs>
+        <w:ind w:left="3600" w:hanging="360"/>
+      </w:pPr>
+    </w:lvl>
+    <w:lvl w:ilvl="5" w:tentative="1">
+      <w:start w:val="1"/>
+      <w:numFmt w:val="decimal"/>
+      <w:lvlText w:val="%6."/>
+      <w:lvlJc w:val="left"/>
+      <w:pPr>
+        <w:tabs>
+          <w:tab w:val="num" w:pos="4320"/>
+        </w:tabs>
+        <w:ind w:left="4320" w:hanging="360"/>
+      </w:pPr>
+    </w:lvl>
+    <w:lvl w:ilvl="6" w:tentative="1">
+      <w:start w:val="1"/>
+      <w:numFmt w:val="decimal"/>
+      <w:lvlText w:val="%7."/>
+      <w:lvlJc w:val="left"/>
+      <w:pPr>
+        <w:tabs>
+          <w:tab w:val="num" w:pos="5040"/>
+        </w:tabs>
+        <w:ind w:left="5040" w:hanging="360"/>
+      </w:pPr>
+    </w:lvl>
+    <w:lvl w:ilvl="7" w:tentative="1">
+      <w:start w:val="1"/>
+      <w:numFmt w:val="decimal"/>
+      <w:lvlText w:val="%8."/>
+      <w:lvlJc w:val="left"/>
+      <w:pPr>
+        <w:tabs>
+          <w:tab w:val="num" w:pos="5760"/>
+        </w:tabs>
+        <w:ind w:left="5760" w:hanging="360"/>
+      </w:pPr>
+    </w:lvl>
+    <w:lvl w:ilvl="8" w:tentative="1">
+      <w:start w:val="1"/>
+      <w:numFmt w:val="decimal"/>
+      <w:lvlText w:val="%9."/>
+      <w:lvlJc w:val="left"/>
+      <w:pPr>
+        <w:tabs>
+          <w:tab w:val="num" w:pos="6480"/>
+        </w:tabs>
+        <w:ind w:left="6480" w:hanging="360"/>
+      </w:pPr>
+    </w:lvl>
+  </w:abstractNum>
+  <w:abstractNum w:abstractNumId="5" w15:restartNumberingAfterBreak="0">
+    <w:nsid w:val="3392241A"/>
+    <w:multiLevelType w:val="multilevel"/>
+    <w:tmpl w:val="65481A5E"/>
+    <w:lvl w:ilvl="0">
+      <w:start w:val="1"/>
+      <w:numFmt w:val="bullet"/>
+      <w:lvlText w:val=""/>
+      <w:lvlJc w:val="left"/>
+      <w:pPr>
+        <w:tabs>
+          <w:tab w:val="num" w:pos="720"/>
+        </w:tabs>
+        <w:ind w:left="720" w:hanging="360"/>
+      </w:pPr>
+      <w:rPr>
+        <w:rFonts w:ascii="Symbol" w:hAnsi="Symbol" w:hint="default"/>
+        <w:sz w:val="20"/>
+      </w:rPr>
+    </w:lvl>
+    <w:lvl w:ilvl="1" w:tentative="1">
+      <w:start w:val="1"/>
+      <w:numFmt w:val="bullet"/>
+      <w:lvlText w:val="o"/>
+      <w:lvlJc w:val="left"/>
+      <w:pPr>
+        <w:tabs>
+          <w:tab w:val="num" w:pos="1440"/>
+        </w:tabs>
+        <w:ind w:left="1440" w:hanging="360"/>
+      </w:pPr>
+      <w:rPr>
+        <w:rFonts w:ascii="Courier New" w:hAnsi="Courier New" w:hint="default"/>
+        <w:sz w:val="20"/>
+      </w:rPr>
+    </w:lvl>
+    <w:lvl w:ilvl="2" w:tentative="1">
+      <w:start w:val="1"/>
+      <w:numFmt w:val="bullet"/>
+      <w:lvlText w:val=""/>
+      <w:lvlJc w:val="left"/>
+      <w:pPr>
+        <w:tabs>
+          <w:tab w:val="num" w:pos="2160"/>
+        </w:tabs>
+        <w:ind w:left="2160" w:hanging="360"/>
+      </w:pPr>
+      <w:rPr>
+        <w:rFonts w:ascii="Wingdings" w:hAnsi="Wingdings" w:hint="default"/>
+        <w:sz w:val="20"/>
+      </w:rPr>
+    </w:lvl>
+    <w:lvl w:ilvl="3" w:tentative="1">
+      <w:start w:val="1"/>
+      <w:numFmt w:val="bullet"/>
+      <w:lvlText w:val=""/>
+      <w:lvlJc w:val="left"/>
+      <w:pPr>
+        <w:tabs>
+          <w:tab w:val="num" w:pos="2880"/>
+        </w:tabs>
+        <w:ind w:left="2880" w:hanging="360"/>
+      </w:pPr>
+      <w:rPr>
+        <w:rFonts w:ascii="Wingdings" w:hAnsi="Wingdings" w:hint="default"/>
+        <w:sz w:val="20"/>
+      </w:rPr>
+    </w:lvl>
+    <w:lvl w:ilvl="4" w:tentative="1">
+      <w:start w:val="1"/>
+      <w:numFmt w:val="bullet"/>
+      <w:lvlText w:val=""/>
+      <w:lvlJc w:val="left"/>
+      <w:pPr>
+        <w:tabs>
+          <w:tab w:val="num" w:pos="3600"/>
+        </w:tabs>
+        <w:ind w:left="3600" w:hanging="360"/>
+      </w:pPr>
+      <w:rPr>
+        <w:rFonts w:ascii="Wingdings" w:hAnsi="Wingdings" w:hint="default"/>
+        <w:sz w:val="20"/>
+      </w:rPr>
+    </w:lvl>
+    <w:lvl w:ilvl="5" w:tentative="1">
+      <w:start w:val="1"/>
+      <w:numFmt w:val="bullet"/>
+      <w:lvlText w:val=""/>
+      <w:lvlJc w:val="left"/>
+      <w:pPr>
+        <w:tabs>
+          <w:tab w:val="num" w:pos="4320"/>
+        </w:tabs>
+        <w:ind w:left="4320" w:hanging="360"/>
+      </w:pPr>
+      <w:rPr>
+        <w:rFonts w:ascii="Wingdings" w:hAnsi="Wingdings" w:hint="default"/>
+        <w:sz w:val="20"/>
+      </w:rPr>
+    </w:lvl>
+    <w:lvl w:ilvl="6" w:tentative="1">
+      <w:start w:val="1"/>
+      <w:numFmt w:val="bullet"/>
+      <w:lvlText w:val=""/>
+      <w:lvlJc w:val="left"/>
+      <w:pPr>
+        <w:tabs>
+          <w:tab w:val="num" w:pos="5040"/>
+        </w:tabs>
+        <w:ind w:left="5040" w:hanging="360"/>
+      </w:pPr>
+      <w:rPr>
+        <w:rFonts w:ascii="Wingdings" w:hAnsi="Wingdings" w:hint="default"/>
+        <w:sz w:val="20"/>
+      </w:rPr>
+    </w:lvl>
+    <w:lvl w:ilvl="7" w:tentative="1">
+      <w:start w:val="1"/>
+      <w:numFmt w:val="bullet"/>
+      <w:lvlText w:val=""/>
+      <w:lvlJc w:val="left"/>
+      <w:pPr>
+        <w:tabs>
+          <w:tab w:val="num" w:pos="5760"/>
+        </w:tabs>
+        <w:ind w:left="5760" w:hanging="360"/>
+      </w:pPr>
+      <w:rPr>
+        <w:rFonts w:ascii="Wingdings" w:hAnsi="Wingdings" w:hint="default"/>
+        <w:sz w:val="20"/>
+      </w:rPr>
+    </w:lvl>
+    <w:lvl w:ilvl="8" w:tentative="1">
+      <w:start w:val="1"/>
+      <w:numFmt w:val="bullet"/>
+      <w:lvlText w:val=""/>
+      <w:lvlJc w:val="left"/>
+      <w:pPr>
+        <w:tabs>
+          <w:tab w:val="num" w:pos="6480"/>
+        </w:tabs>
+        <w:ind w:left="6480" w:hanging="360"/>
+      </w:pPr>
+      <w:rPr>
+        <w:rFonts w:ascii="Wingdings" w:hAnsi="Wingdings" w:hint="default"/>
+        <w:sz w:val="20"/>
+      </w:rPr>
+    </w:lvl>
+  </w:abstractNum>
+  <w:abstractNum w:abstractNumId="6" w15:restartNumberingAfterBreak="0">
     <w:nsid w:val="442D4193"/>
     <w:multiLevelType w:val="multilevel"/>
     <w:tmpl w:val="DF6A6DE0"/>
@@ -2053,7 +3956,305 @@
       </w:rPr>
     </w:lvl>
   </w:abstractNum>
-  <w:abstractNum w:abstractNumId="4" w15:restartNumberingAfterBreak="0">
+  <w:abstractNum w:abstractNumId="7" w15:restartNumberingAfterBreak="0">
+    <w:nsid w:val="52D3299D"/>
+    <w:multiLevelType w:val="multilevel"/>
+    <w:tmpl w:val="5026227E"/>
+    <w:lvl w:ilvl="0">
+      <w:start w:val="1"/>
+      <w:numFmt w:val="bullet"/>
+      <w:lvlText w:val=""/>
+      <w:lvlJc w:val="left"/>
+      <w:pPr>
+        <w:tabs>
+          <w:tab w:val="num" w:pos="720"/>
+        </w:tabs>
+        <w:ind w:left="720" w:hanging="360"/>
+      </w:pPr>
+      <w:rPr>
+        <w:rFonts w:ascii="Symbol" w:hAnsi="Symbol" w:hint="default"/>
+        <w:sz w:val="20"/>
+      </w:rPr>
+    </w:lvl>
+    <w:lvl w:ilvl="1" w:tentative="1">
+      <w:start w:val="1"/>
+      <w:numFmt w:val="bullet"/>
+      <w:lvlText w:val="o"/>
+      <w:lvlJc w:val="left"/>
+      <w:pPr>
+        <w:tabs>
+          <w:tab w:val="num" w:pos="1440"/>
+        </w:tabs>
+        <w:ind w:left="1440" w:hanging="360"/>
+      </w:pPr>
+      <w:rPr>
+        <w:rFonts w:ascii="Courier New" w:hAnsi="Courier New" w:hint="default"/>
+        <w:sz w:val="20"/>
+      </w:rPr>
+    </w:lvl>
+    <w:lvl w:ilvl="2" w:tentative="1">
+      <w:start w:val="1"/>
+      <w:numFmt w:val="bullet"/>
+      <w:lvlText w:val=""/>
+      <w:lvlJc w:val="left"/>
+      <w:pPr>
+        <w:tabs>
+          <w:tab w:val="num" w:pos="2160"/>
+        </w:tabs>
+        <w:ind w:left="2160" w:hanging="360"/>
+      </w:pPr>
+      <w:rPr>
+        <w:rFonts w:ascii="Wingdings" w:hAnsi="Wingdings" w:hint="default"/>
+        <w:sz w:val="20"/>
+      </w:rPr>
+    </w:lvl>
+    <w:lvl w:ilvl="3" w:tentative="1">
+      <w:start w:val="1"/>
+      <w:numFmt w:val="bullet"/>
+      <w:lvlText w:val=""/>
+      <w:lvlJc w:val="left"/>
+      <w:pPr>
+        <w:tabs>
+          <w:tab w:val="num" w:pos="2880"/>
+        </w:tabs>
+        <w:ind w:left="2880" w:hanging="360"/>
+      </w:pPr>
+      <w:rPr>
+        <w:rFonts w:ascii="Wingdings" w:hAnsi="Wingdings" w:hint="default"/>
+        <w:sz w:val="20"/>
+      </w:rPr>
+    </w:lvl>
+    <w:lvl w:ilvl="4" w:tentative="1">
+      <w:start w:val="1"/>
+      <w:numFmt w:val="bullet"/>
+      <w:lvlText w:val=""/>
+      <w:lvlJc w:val="left"/>
+      <w:pPr>
+        <w:tabs>
+          <w:tab w:val="num" w:pos="3600"/>
+        </w:tabs>
+        <w:ind w:left="3600" w:hanging="360"/>
+      </w:pPr>
+      <w:rPr>
+        <w:rFonts w:ascii="Wingdings" w:hAnsi="Wingdings" w:hint="default"/>
+        <w:sz w:val="20"/>
+      </w:rPr>
+    </w:lvl>
+    <w:lvl w:ilvl="5" w:tentative="1">
+      <w:start w:val="1"/>
+      <w:numFmt w:val="bullet"/>
+      <w:lvlText w:val=""/>
+      <w:lvlJc w:val="left"/>
+      <w:pPr>
+        <w:tabs>
+          <w:tab w:val="num" w:pos="4320"/>
+        </w:tabs>
+        <w:ind w:left="4320" w:hanging="360"/>
+      </w:pPr>
+      <w:rPr>
+        <w:rFonts w:ascii="Wingdings" w:hAnsi="Wingdings" w:hint="default"/>
+        <w:sz w:val="20"/>
+      </w:rPr>
+    </w:lvl>
+    <w:lvl w:ilvl="6" w:tentative="1">
+      <w:start w:val="1"/>
+      <w:numFmt w:val="bullet"/>
+      <w:lvlText w:val=""/>
+      <w:lvlJc w:val="left"/>
+      <w:pPr>
+        <w:tabs>
+          <w:tab w:val="num" w:pos="5040"/>
+        </w:tabs>
+        <w:ind w:left="5040" w:hanging="360"/>
+      </w:pPr>
+      <w:rPr>
+        <w:rFonts w:ascii="Wingdings" w:hAnsi="Wingdings" w:hint="default"/>
+        <w:sz w:val="20"/>
+      </w:rPr>
+    </w:lvl>
+    <w:lvl w:ilvl="7" w:tentative="1">
+      <w:start w:val="1"/>
+      <w:numFmt w:val="bullet"/>
+      <w:lvlText w:val=""/>
+      <w:lvlJc w:val="left"/>
+      <w:pPr>
+        <w:tabs>
+          <w:tab w:val="num" w:pos="5760"/>
+        </w:tabs>
+        <w:ind w:left="5760" w:hanging="360"/>
+      </w:pPr>
+      <w:rPr>
+        <w:rFonts w:ascii="Wingdings" w:hAnsi="Wingdings" w:hint="default"/>
+        <w:sz w:val="20"/>
+      </w:rPr>
+    </w:lvl>
+    <w:lvl w:ilvl="8" w:tentative="1">
+      <w:start w:val="1"/>
+      <w:numFmt w:val="bullet"/>
+      <w:lvlText w:val=""/>
+      <w:lvlJc w:val="left"/>
+      <w:pPr>
+        <w:tabs>
+          <w:tab w:val="num" w:pos="6480"/>
+        </w:tabs>
+        <w:ind w:left="6480" w:hanging="360"/>
+      </w:pPr>
+      <w:rPr>
+        <w:rFonts w:ascii="Wingdings" w:hAnsi="Wingdings" w:hint="default"/>
+        <w:sz w:val="20"/>
+      </w:rPr>
+    </w:lvl>
+  </w:abstractNum>
+  <w:abstractNum w:abstractNumId="8" w15:restartNumberingAfterBreak="0">
+    <w:nsid w:val="71133454"/>
+    <w:multiLevelType w:val="multilevel"/>
+    <w:tmpl w:val="8E224BAE"/>
+    <w:lvl w:ilvl="0">
+      <w:start w:val="1"/>
+      <w:numFmt w:val="bullet"/>
+      <w:lvlText w:val=""/>
+      <w:lvlJc w:val="left"/>
+      <w:pPr>
+        <w:tabs>
+          <w:tab w:val="num" w:pos="720"/>
+        </w:tabs>
+        <w:ind w:left="720" w:hanging="360"/>
+      </w:pPr>
+      <w:rPr>
+        <w:rFonts w:ascii="Symbol" w:hAnsi="Symbol" w:hint="default"/>
+        <w:sz w:val="20"/>
+      </w:rPr>
+    </w:lvl>
+    <w:lvl w:ilvl="1" w:tentative="1">
+      <w:start w:val="1"/>
+      <w:numFmt w:val="bullet"/>
+      <w:lvlText w:val="o"/>
+      <w:lvlJc w:val="left"/>
+      <w:pPr>
+        <w:tabs>
+          <w:tab w:val="num" w:pos="1440"/>
+        </w:tabs>
+        <w:ind w:left="1440" w:hanging="360"/>
+      </w:pPr>
+      <w:rPr>
+        <w:rFonts w:ascii="Courier New" w:hAnsi="Courier New" w:hint="default"/>
+        <w:sz w:val="20"/>
+      </w:rPr>
+    </w:lvl>
+    <w:lvl w:ilvl="2" w:tentative="1">
+      <w:start w:val="1"/>
+      <w:numFmt w:val="bullet"/>
+      <w:lvlText w:val=""/>
+      <w:lvlJc w:val="left"/>
+      <w:pPr>
+        <w:tabs>
+          <w:tab w:val="num" w:pos="2160"/>
+        </w:tabs>
+        <w:ind w:left="2160" w:hanging="360"/>
+      </w:pPr>
+      <w:rPr>
+        <w:rFonts w:ascii="Wingdings" w:hAnsi="Wingdings" w:hint="default"/>
+        <w:sz w:val="20"/>
+      </w:rPr>
+    </w:lvl>
+    <w:lvl w:ilvl="3" w:tentative="1">
+      <w:start w:val="1"/>
+      <w:numFmt w:val="bullet"/>
+      <w:lvlText w:val=""/>
+      <w:lvlJc w:val="left"/>
+      <w:pPr>
+        <w:tabs>
+          <w:tab w:val="num" w:pos="2880"/>
+        </w:tabs>
+        <w:ind w:left="2880" w:hanging="360"/>
+      </w:pPr>
+      <w:rPr>
+        <w:rFonts w:ascii="Wingdings" w:hAnsi="Wingdings" w:hint="default"/>
+        <w:sz w:val="20"/>
+      </w:rPr>
+    </w:lvl>
+    <w:lvl w:ilvl="4" w:tentative="1">
+      <w:start w:val="1"/>
+      <w:numFmt w:val="bullet"/>
+      <w:lvlText w:val=""/>
+      <w:lvlJc w:val="left"/>
+      <w:pPr>
+        <w:tabs>
+          <w:tab w:val="num" w:pos="3600"/>
+        </w:tabs>
+        <w:ind w:left="3600" w:hanging="360"/>
+      </w:pPr>
+      <w:rPr>
+        <w:rFonts w:ascii="Wingdings" w:hAnsi="Wingdings" w:hint="default"/>
+        <w:sz w:val="20"/>
+      </w:rPr>
+    </w:lvl>
+    <w:lvl w:ilvl="5" w:tentative="1">
+      <w:start w:val="1"/>
+      <w:numFmt w:val="bullet"/>
+      <w:lvlText w:val=""/>
+      <w:lvlJc w:val="left"/>
+      <w:pPr>
+        <w:tabs>
+          <w:tab w:val="num" w:pos="4320"/>
+        </w:tabs>
+        <w:ind w:left="4320" w:hanging="360"/>
+      </w:pPr>
+      <w:rPr>
+        <w:rFonts w:ascii="Wingdings" w:hAnsi="Wingdings" w:hint="default"/>
+        <w:sz w:val="20"/>
+      </w:rPr>
+    </w:lvl>
+    <w:lvl w:ilvl="6" w:tentative="1">
+      <w:start w:val="1"/>
+      <w:numFmt w:val="bullet"/>
+      <w:lvlText w:val=""/>
+      <w:lvlJc w:val="left"/>
+      <w:pPr>
+        <w:tabs>
+          <w:tab w:val="num" w:pos="5040"/>
+        </w:tabs>
+        <w:ind w:left="5040" w:hanging="360"/>
+      </w:pPr>
+      <w:rPr>
+        <w:rFonts w:ascii="Wingdings" w:hAnsi="Wingdings" w:hint="default"/>
+        <w:sz w:val="20"/>
+      </w:rPr>
+    </w:lvl>
+    <w:lvl w:ilvl="7" w:tentative="1">
+      <w:start w:val="1"/>
+      <w:numFmt w:val="bullet"/>
+      <w:lvlText w:val=""/>
+      <w:lvlJc w:val="left"/>
+      <w:pPr>
+        <w:tabs>
+          <w:tab w:val="num" w:pos="5760"/>
+        </w:tabs>
+        <w:ind w:left="5760" w:hanging="360"/>
+      </w:pPr>
+      <w:rPr>
+        <w:rFonts w:ascii="Wingdings" w:hAnsi="Wingdings" w:hint="default"/>
+        <w:sz w:val="20"/>
+      </w:rPr>
+    </w:lvl>
+    <w:lvl w:ilvl="8" w:tentative="1">
+      <w:start w:val="1"/>
+      <w:numFmt w:val="bullet"/>
+      <w:lvlText w:val=""/>
+      <w:lvlJc w:val="left"/>
+      <w:pPr>
+        <w:tabs>
+          <w:tab w:val="num" w:pos="6480"/>
+        </w:tabs>
+        <w:ind w:left="6480" w:hanging="360"/>
+      </w:pPr>
+      <w:rPr>
+        <w:rFonts w:ascii="Wingdings" w:hAnsi="Wingdings" w:hint="default"/>
+        <w:sz w:val="20"/>
+      </w:rPr>
+    </w:lvl>
+  </w:abstractNum>
+  <w:abstractNum w:abstractNumId="9" w15:restartNumberingAfterBreak="0">
     <w:nsid w:val="7D335CD9"/>
     <w:multiLevelType w:val="multilevel"/>
     <w:tmpl w:val="63286EAA"/>
@@ -2203,19 +4404,34 @@
     </w:lvl>
   </w:abstractNum>
   <w:num w:numId="1" w16cid:durableId="1257178876">
+    <w:abstractNumId w:val="1"/>
+  </w:num>
+  <w:num w:numId="2" w16cid:durableId="112674435">
+    <w:abstractNumId w:val="2"/>
+  </w:num>
+  <w:num w:numId="3" w16cid:durableId="48379061">
+    <w:abstractNumId w:val="9"/>
+  </w:num>
+  <w:num w:numId="4" w16cid:durableId="1399472957">
+    <w:abstractNumId w:val="6"/>
+  </w:num>
+  <w:num w:numId="5" w16cid:durableId="716006807">
+    <w:abstractNumId w:val="3"/>
+  </w:num>
+  <w:num w:numId="6" w16cid:durableId="645861978">
     <w:abstractNumId w:val="0"/>
   </w:num>
-  <w:num w:numId="2" w16cid:durableId="112674435">
-    <w:abstractNumId w:val="1"/>
+  <w:num w:numId="7" w16cid:durableId="6685631">
+    <w:abstractNumId w:val="5"/>
   </w:num>
-  <w:num w:numId="3" w16cid:durableId="48379061">
+  <w:num w:numId="8" w16cid:durableId="1678772852">
+    <w:abstractNumId w:val="7"/>
+  </w:num>
+  <w:num w:numId="9" w16cid:durableId="1933735834">
+    <w:abstractNumId w:val="8"/>
+  </w:num>
+  <w:num w:numId="10" w16cid:durableId="1509444711">
     <w:abstractNumId w:val="4"/>
-  </w:num>
-  <w:num w:numId="4" w16cid:durableId="1399472957">
-    <w:abstractNumId w:val="3"/>
-  </w:num>
-  <w:num w:numId="5" w16cid:durableId="716006807">
-    <w:abstractNumId w:val="2"/>
   </w:num>
 </w:numbering>
 </file>
@@ -3159,6 +5375,17 @@
       <w:shd w:val="clear" w:color="auto" w:fill="E1DFDD"/>
     </w:rPr>
   </w:style>
+  <w:style w:type="paragraph" w:styleId="NormalWeb">
+    <w:name w:val="Normal (Web)"/>
+    <w:basedOn w:val="Normal"/>
+    <w:uiPriority w:val="99"/>
+    <w:semiHidden/>
+    <w:unhideWhenUsed/>
+    <w:rsid w:val="006072D3"/>
+    <w:rPr>
+      <w:rFonts w:ascii="Times New Roman" w:hAnsi="Times New Roman" w:cs="Times New Roman"/>
+    </w:rPr>
+  </w:style>
 </w:styles>
 </file>
 

</xml_diff>